<commit_message>
update the defect log
</commit_message>
<xml_diff>
--- a/Submission 3 docs/Defect_Log.docx
+++ b/Submission 3 docs/Defect_Log.docx
@@ -16,7 +16,33 @@
           <w:sz w:val="18"/>
           <w:szCs w:val="18"/>
         </w:rPr>
-        <w:t>Assignment 3  ·  Defect Log</w:t>
+        <w:t xml:space="preserve">Assignment </w:t>
+      </w:r>
+      <w:proofErr w:type="gramStart"/>
+      <w:r>
+        <w:rPr>
+          <w:b/>
+          <w:bCs/>
+          <w:caps/>
+          <w:color w:val="B5522B"/>
+          <w:spacing w:val="40"/>
+          <w:sz w:val="18"/>
+          <w:szCs w:val="18"/>
+        </w:rPr>
+        <w:t>3  ·</w:t>
+      </w:r>
+      <w:proofErr w:type="gramEnd"/>
+      <w:r>
+        <w:rPr>
+          <w:b/>
+          <w:bCs/>
+          <w:caps/>
+          <w:color w:val="B5522B"/>
+          <w:spacing w:val="40"/>
+          <w:sz w:val="18"/>
+          <w:szCs w:val="18"/>
+        </w:rPr>
+        <w:t xml:space="preserve">  Defect Log</w:t>
       </w:r>
     </w:p>
     <w:p>
@@ -60,7 +86,15 @@
         <w:spacing w:after="130" w:line="275" w:lineRule="auto"/>
       </w:pPr>
       <w:r>
-        <w:t>Two entries carry the status Not a defect. Both initially presented as application faults and were only separated by investigation. They are recorded rather than deleted because distinguishing them took work, and because reporting either as an application defect would have undermined the rest of the log.</w:t>
+        <w:t xml:space="preserve">Two entries carry the status Not a defect. Both initially presented as application faults and were only separated by investigation. They are recorded rather than deleted because distinguishing them took work, and because reporting </w:t>
+      </w:r>
+      <w:proofErr w:type="gramStart"/>
+      <w:r>
+        <w:t>either as</w:t>
+      </w:r>
+      <w:proofErr w:type="gramEnd"/>
+      <w:r>
+        <w:t xml:space="preserve"> an application defect would have undermined the rest of the log.</w:t>
       </w:r>
     </w:p>
     <w:p>
@@ -105,7 +139,25 @@
           <w:sz w:val="24"/>
           <w:szCs w:val="24"/>
         </w:rPr>
-        <w:t>Portfolio API reports a total 999.00 higher than the sum of its own holdings</w:t>
+        <w:t xml:space="preserve">Portfolio API reports a </w:t>
+      </w:r>
+      <w:proofErr w:type="gramStart"/>
+      <w:r>
+        <w:rPr>
+          <w:rFonts w:ascii="Georgia" w:eastAsia="Georgia" w:hAnsi="Georgia" w:cs="Georgia"/>
+          <w:sz w:val="24"/>
+          <w:szCs w:val="24"/>
+        </w:rPr>
+        <w:t>total</w:t>
+      </w:r>
+      <w:proofErr w:type="gramEnd"/>
+      <w:r>
+        <w:rPr>
+          <w:rFonts w:ascii="Georgia" w:eastAsia="Georgia" w:hAnsi="Georgia" w:cs="Georgia"/>
+          <w:sz w:val="24"/>
+          <w:szCs w:val="24"/>
+        </w:rPr>
+        <w:t xml:space="preserve"> 999.00 higher than the sum of its own holdings</w:t>
       </w:r>
     </w:p>
     <w:tbl>
@@ -130,12 +182,6 @@
         <w:gridCol w:w="7000"/>
       </w:tblGrid>
       <w:tr>
-        <w:tblPrEx>
-          <w:tblCellMar>
-            <w:top w:w="0" w:type="dxa"/>
-            <w:bottom w:w="0" w:type="dxa"/>
-          </w:tblCellMar>
-        </w:tblPrEx>
         <w:tc>
           <w:tcPr>
             <w:tcW w:w="2200" w:type="dxa"/>
@@ -185,34 +231,12 @@
                 <w:sz w:val="20"/>
                 <w:szCs w:val="20"/>
               </w:rPr>
-              <w:t>FinServe Retail — Portfolio and /</w:t>
-            </w:r>
-            <w:proofErr w:type="spellStart"/>
-            <w:r>
-              <w:rPr>
-                <w:sz w:val="20"/>
-                <w:szCs w:val="20"/>
-              </w:rPr>
-              <w:t>api</w:t>
-            </w:r>
-            <w:proofErr w:type="spellEnd"/>
-            <w:r>
-              <w:rPr>
-                <w:sz w:val="20"/>
-                <w:szCs w:val="20"/>
-              </w:rPr>
-              <w:t>/portfolio</w:t>
+              <w:t>FinServe Retail — Portfolio and /api/portfolio</w:t>
             </w:r>
           </w:p>
         </w:tc>
       </w:tr>
       <w:tr>
-        <w:tblPrEx>
-          <w:tblCellMar>
-            <w:top w:w="0" w:type="dxa"/>
-            <w:bottom w:w="0" w:type="dxa"/>
-          </w:tblCellMar>
-        </w:tblPrEx>
         <w:tc>
           <w:tcPr>
             <w:tcW w:w="2200" w:type="dxa"/>
@@ -271,12 +295,6 @@
         </w:tc>
       </w:tr>
       <w:tr>
-        <w:tblPrEx>
-          <w:tblCellMar>
-            <w:top w:w="0" w:type="dxa"/>
-            <w:bottom w:w="0" w:type="dxa"/>
-          </w:tblCellMar>
-        </w:tblPrEx>
         <w:tc>
           <w:tcPr>
             <w:tcW w:w="2200" w:type="dxa"/>
@@ -332,12 +350,6 @@
         </w:tc>
       </w:tr>
       <w:tr>
-        <w:tblPrEx>
-          <w:tblCellMar>
-            <w:top w:w="0" w:type="dxa"/>
-            <w:bottom w:w="0" w:type="dxa"/>
-          </w:tblCellMar>
-        </w:tblPrEx>
         <w:tc>
           <w:tcPr>
             <w:tcW w:w="2200" w:type="dxa"/>
@@ -393,12 +405,6 @@
         </w:tc>
       </w:tr>
       <w:tr>
-        <w:tblPrEx>
-          <w:tblCellMar>
-            <w:top w:w="0" w:type="dxa"/>
-            <w:bottom w:w="0" w:type="dxa"/>
-          </w:tblCellMar>
-        </w:tblPrEx>
         <w:tc>
           <w:tcPr>
             <w:tcW w:w="2200" w:type="dxa"/>
@@ -476,23 +482,7 @@
         <w:spacing w:after="130" w:line="275" w:lineRule="auto"/>
       </w:pPr>
       <w:r>
-        <w:t xml:space="preserve">User </w:t>
-      </w:r>
-      <w:proofErr w:type="spellStart"/>
-      <w:r>
-        <w:t>qauser@finserve.test</w:t>
-      </w:r>
-      <w:proofErr w:type="spellEnd"/>
-      <w:r>
-        <w:t xml:space="preserve"> on FinServe Retail, port 8082. The customer holds four mutual fund positions: FOL-QA-001, FOL-QA-002, FOL-0004-FSMID003 and FOL-0004-FSDIV012. API key qa-demo-token-123 supplied in the X-API-Key header. No defect flag is exposed in the interface for this </w:t>
-      </w:r>
-      <w:proofErr w:type="spellStart"/>
-      <w:r>
-        <w:t>behaviour</w:t>
-      </w:r>
-      <w:proofErr w:type="spellEnd"/>
-      <w:r>
-        <w:t>.</w:t>
+        <w:t>User qauser@finserve.test on FinServe Retail, port 8082. The customer holds four mutual fund positions: FOL-QA-001, FOL-QA-002, FOL-0004-FSMID003 and FOL-0004-FSDIV012. API key qa-demo-token-123 supplied in the X-API-Key header. No defect flag is exposed in the interface for this behaviour.</w:t>
       </w:r>
     </w:p>
     <w:p>
@@ -522,13 +512,8 @@
         <w:spacing w:after="50" w:line="265" w:lineRule="auto"/>
       </w:pPr>
       <w:r>
-        <w:t xml:space="preserve">Sign in as </w:t>
-      </w:r>
-      <w:proofErr w:type="spellStart"/>
-      <w:r>
-        <w:t>qauser@finserve.test</w:t>
-      </w:r>
-      <w:proofErr w:type="spellEnd"/>
+        <w:t>Sign in as qauser@finserve.test</w:t>
+      </w:r>
     </w:p>
     <w:p>
       <w:pPr>
@@ -566,15 +551,7 @@
         <w:spacing w:after="50" w:line="265" w:lineRule="auto"/>
       </w:pPr>
       <w:r>
-        <w:t>Call GET /</w:t>
-      </w:r>
-      <w:proofErr w:type="spellStart"/>
-      <w:r>
-        <w:t>api</w:t>
-      </w:r>
-      <w:proofErr w:type="spellEnd"/>
-      <w:r>
-        <w:t>/portfolio with the X-API-Key header</w:t>
+        <w:t>Call GET /api/portfolio with the X-API-Key header</w:t>
       </w:r>
     </w:p>
     <w:p>
@@ -587,23 +564,7 @@
         <w:spacing w:after="50" w:line="265" w:lineRule="auto"/>
       </w:pPr>
       <w:r>
-        <w:t xml:space="preserve">Read </w:t>
-      </w:r>
-      <w:proofErr w:type="spellStart"/>
-      <w:r>
-        <w:t>reported_portfolio_total</w:t>
-      </w:r>
-      <w:proofErr w:type="spellEnd"/>
-      <w:r>
-        <w:t xml:space="preserve"> and </w:t>
-      </w:r>
-      <w:proofErr w:type="spellStart"/>
-      <w:r>
-        <w:t>sum_of_holding_values</w:t>
-      </w:r>
-      <w:proofErr w:type="spellEnd"/>
-      <w:r>
-        <w:t xml:space="preserve"> from the response</w:t>
+        <w:t>Read reported_portfolio_total and sum_of_holding_values from the response</w:t>
       </w:r>
     </w:p>
     <w:p>
@@ -641,15 +602,7 @@
         <w:spacing w:after="130" w:line="275" w:lineRule="auto"/>
       </w:pPr>
       <w:r>
-        <w:t xml:space="preserve">All three agree. A portfolio total is the sum of the holdings it </w:t>
-      </w:r>
-      <w:proofErr w:type="spellStart"/>
-      <w:r>
-        <w:t>summarises</w:t>
-      </w:r>
-      <w:proofErr w:type="spellEnd"/>
-      <w:r>
-        <w:t>.</w:t>
+        <w:t>All three agree. A portfolio total is the sum of the holdings it summarises.</w:t>
       </w:r>
     </w:p>
     <w:p>
@@ -673,21 +626,8 @@
       <w:pPr>
         <w:spacing w:after="130" w:line="275" w:lineRule="auto"/>
       </w:pPr>
-      <w:proofErr w:type="spellStart"/>
-      <w:r>
-        <w:t>reported_portfolio_total</w:t>
-      </w:r>
-      <w:proofErr w:type="spellEnd"/>
-      <w:r>
-        <w:t xml:space="preserve"> is exactly 999.00 higher than </w:t>
-      </w:r>
-      <w:proofErr w:type="spellStart"/>
-      <w:r>
-        <w:t>sum_of_holding_values</w:t>
-      </w:r>
-      <w:proofErr w:type="spellEnd"/>
-      <w:r>
-        <w:t>, and both appear in the same response. The portfolio page shows the correct figure. Observed at totals of 67,005 / 77,005 / 87,005 / 102,005 / 132,005 with the gap constant at 999.00 each time, which rules out rounding.</w:t>
+      <w:r>
+        <w:t>reported_portfolio_total is exactly 999.00 higher than sum_of_holding_values, and both appear in the same response. The portfolio page shows the correct figure. Observed at totals of 67,005 / 77,005 / 87,005 / 102,005 / 132,005 with the gap constant at 999.00 each time, which rules out rounding.</w:t>
       </w:r>
     </w:p>
     <w:p>
@@ -711,13 +651,8 @@
       <w:pPr>
         <w:spacing w:after="130" w:line="275" w:lineRule="auto"/>
       </w:pPr>
-      <w:proofErr w:type="spellStart"/>
-      <w:r>
-        <w:t>reported_portfolio_total</w:t>
-      </w:r>
-      <w:proofErr w:type="spellEnd"/>
-      <w:r>
-        <w:t xml:space="preserve"> is the customer’s net worth figure. Any system consuming this endpoint receives an inflated total while the website shows the correct one, so the two channels disagree about a customer’s money. Which systems read this field could not be determined from black-box testing, so the actual exposure depends on API usage not visible from the application under test. Reconciliation and reporting would both be affected.</w:t>
+      <w:r>
+        <w:t>reported_portfolio_total is the customer’s net worth figure. Any system consuming this endpoint receives an inflated total while the website shows the correct one, so the two channels disagree about a customer’s money. Which systems read this field could not be determined from black-box testing, so the actual exposure depends on API usage not visible from the application under test. Reconciliation and reporting would both be affected.</w:t>
       </w:r>
     </w:p>
     <w:p>
@@ -763,12 +698,6 @@
         <w:gridCol w:w="9324"/>
       </w:tblGrid>
       <w:tr>
-        <w:tblPrEx>
-          <w:tblCellMar>
-            <w:top w:w="0" w:type="dxa"/>
-            <w:bottom w:w="0" w:type="dxa"/>
-          </w:tblCellMar>
-        </w:tblPrEx>
         <w:tc>
           <w:tcPr>
             <w:tcW w:w="9200" w:type="dxa"/>
@@ -789,6 +718,7 @@
                 <w:b/>
                 <w:bCs/>
                 <w:caps/>
+                <w:noProof/>
                 <w:color w:val="B5522B"/>
                 <w:spacing w:val="20"/>
                 <w:sz w:val="19"/>
@@ -861,12 +791,6 @@
         <w:gridCol w:w="9324"/>
       </w:tblGrid>
       <w:tr>
-        <w:tblPrEx>
-          <w:tblCellMar>
-            <w:top w:w="0" w:type="dxa"/>
-            <w:bottom w:w="0" w:type="dxa"/>
-          </w:tblCellMar>
-        </w:tblPrEx>
         <w:tc>
           <w:tcPr>
             <w:tcW w:w="9200" w:type="dxa"/>
@@ -887,6 +811,7 @@
                 <w:b/>
                 <w:bCs/>
                 <w:caps/>
+                <w:noProof/>
                 <w:color w:val="B5522B"/>
                 <w:spacing w:val="20"/>
                 <w:sz w:val="19"/>
@@ -987,12 +912,6 @@
         <w:gridCol w:w="7000"/>
       </w:tblGrid>
       <w:tr>
-        <w:tblPrEx>
-          <w:tblCellMar>
-            <w:top w:w="0" w:type="dxa"/>
-            <w:bottom w:w="0" w:type="dxa"/>
-          </w:tblCellMar>
-        </w:tblPrEx>
         <w:tc>
           <w:tcPr>
             <w:tcW w:w="2200" w:type="dxa"/>
@@ -1048,12 +967,6 @@
         </w:tc>
       </w:tr>
       <w:tr>
-        <w:tblPrEx>
-          <w:tblCellMar>
-            <w:top w:w="0" w:type="dxa"/>
-            <w:bottom w:w="0" w:type="dxa"/>
-          </w:tblCellMar>
-        </w:tblPrEx>
         <w:tc>
           <w:tcPr>
             <w:tcW w:w="2200" w:type="dxa"/>
@@ -1112,12 +1025,6 @@
         </w:tc>
       </w:tr>
       <w:tr>
-        <w:tblPrEx>
-          <w:tblCellMar>
-            <w:top w:w="0" w:type="dxa"/>
-            <w:bottom w:w="0" w:type="dxa"/>
-          </w:tblCellMar>
-        </w:tblPrEx>
         <w:tc>
           <w:tcPr>
             <w:tcW w:w="2200" w:type="dxa"/>
@@ -1173,12 +1080,6 @@
         </w:tc>
       </w:tr>
       <w:tr>
-        <w:tblPrEx>
-          <w:tblCellMar>
-            <w:top w:w="0" w:type="dxa"/>
-            <w:bottom w:w="0" w:type="dxa"/>
-          </w:tblCellMar>
-        </w:tblPrEx>
         <w:tc>
           <w:tcPr>
             <w:tcW w:w="2200" w:type="dxa"/>
@@ -1234,12 +1135,6 @@
         </w:tc>
       </w:tr>
       <w:tr>
-        <w:tblPrEx>
-          <w:tblCellMar>
-            <w:top w:w="0" w:type="dxa"/>
-            <w:bottom w:w="0" w:type="dxa"/>
-          </w:tblCellMar>
-        </w:tblPrEx>
         <w:tc>
           <w:tcPr>
             <w:tcW w:w="2200" w:type="dxa"/>
@@ -1317,31 +1212,7 @@
         <w:spacing w:after="130" w:line="275" w:lineRule="auto"/>
       </w:pPr>
       <w:r>
-        <w:t xml:space="preserve">User </w:t>
-      </w:r>
-      <w:proofErr w:type="spellStart"/>
-      <w:r>
-        <w:t>qauser@finserve.test</w:t>
-      </w:r>
-      <w:proofErr w:type="spellEnd"/>
-      <w:r>
-        <w:t xml:space="preserve"> on FinServe Retail. Transaction history containing the seeded record TXN-QA-FAIL-001, </w:t>
-      </w:r>
-      <w:proofErr w:type="spellStart"/>
-      <w:r>
-        <w:t>transaction_type</w:t>
-      </w:r>
-      <w:proofErr w:type="spellEnd"/>
-      <w:r>
-        <w:t xml:space="preserve"> Failed Payment. API key supplied in the X-API-Key header. No defect flag is exposed in the interface, but the </w:t>
-      </w:r>
-      <w:proofErr w:type="spellStart"/>
-      <w:r>
-        <w:t>behaviour</w:t>
-      </w:r>
-      <w:proofErr w:type="spellEnd"/>
-      <w:r>
-        <w:t xml:space="preserve"> changed between runs with no code change, so it appears to be toggled server-side.</w:t>
+        <w:t>User qauser@finserve.test on FinServe Retail. Transaction history containing the seeded record TXN-QA-FAIL-001, transaction_type Failed Payment. API key supplied in the X-API-Key header. No defect flag is exposed in the interface, but the behaviour changed between runs with no code change, so it appears to be toggled server-side.</w:t>
       </w:r>
     </w:p>
     <w:p>
@@ -1371,13 +1242,8 @@
         <w:spacing w:after="50" w:line="265" w:lineRule="auto"/>
       </w:pPr>
       <w:r>
-        <w:t xml:space="preserve">Sign in as </w:t>
-      </w:r>
-      <w:proofErr w:type="spellStart"/>
-      <w:r>
-        <w:t>qauser@finserve.test</w:t>
-      </w:r>
-      <w:proofErr w:type="spellEnd"/>
+        <w:t>Sign in as qauser@finserve.test</w:t>
+      </w:r>
     </w:p>
     <w:p>
       <w:pPr>
@@ -1389,15 +1255,7 @@
         <w:spacing w:after="50" w:line="265" w:lineRule="auto"/>
       </w:pPr>
       <w:r>
-        <w:t>Call GET /</w:t>
-      </w:r>
-      <w:proofErr w:type="spellStart"/>
-      <w:r>
-        <w:t>api</w:t>
-      </w:r>
-      <w:proofErr w:type="spellEnd"/>
-      <w:r>
-        <w:t>/transactions and locate TXN-QA-FAIL-001</w:t>
+        <w:t>Call GET /api/transactions and locate TXN-QA-FAIL-001</w:t>
       </w:r>
     </w:p>
     <w:p>
@@ -1557,12 +1415,6 @@
         <w:gridCol w:w="9324"/>
       </w:tblGrid>
       <w:tr>
-        <w:tblPrEx>
-          <w:tblCellMar>
-            <w:top w:w="0" w:type="dxa"/>
-            <w:bottom w:w="0" w:type="dxa"/>
-          </w:tblCellMar>
-        </w:tblPrEx>
         <w:tc>
           <w:tcPr>
             <w:tcW w:w="9324" w:type="dxa"/>
@@ -1623,12 +1475,6 @@
         </w:tc>
       </w:tr>
       <w:tr>
-        <w:tblPrEx>
-          <w:tblCellMar>
-            <w:top w:w="0" w:type="dxa"/>
-            <w:bottom w:w="0" w:type="dxa"/>
-          </w:tblCellMar>
-        </w:tblPrEx>
         <w:tc>
           <w:tcPr>
             <w:tcW w:w="9324" w:type="dxa"/>
@@ -1754,12 +1600,6 @@
         <w:gridCol w:w="7000"/>
       </w:tblGrid>
       <w:tr>
-        <w:tblPrEx>
-          <w:tblCellMar>
-            <w:top w:w="0" w:type="dxa"/>
-            <w:bottom w:w="0" w:type="dxa"/>
-          </w:tblCellMar>
-        </w:tblPrEx>
         <w:tc>
           <w:tcPr>
             <w:tcW w:w="2200" w:type="dxa"/>
@@ -1815,12 +1655,6 @@
         </w:tc>
       </w:tr>
       <w:tr>
-        <w:tblPrEx>
-          <w:tblCellMar>
-            <w:top w:w="0" w:type="dxa"/>
-            <w:bottom w:w="0" w:type="dxa"/>
-          </w:tblCellMar>
-        </w:tblPrEx>
         <w:tc>
           <w:tcPr>
             <w:tcW w:w="2200" w:type="dxa"/>
@@ -1879,12 +1713,6 @@
         </w:tc>
       </w:tr>
       <w:tr>
-        <w:tblPrEx>
-          <w:tblCellMar>
-            <w:top w:w="0" w:type="dxa"/>
-            <w:bottom w:w="0" w:type="dxa"/>
-          </w:tblCellMar>
-        </w:tblPrEx>
         <w:tc>
           <w:tcPr>
             <w:tcW w:w="2200" w:type="dxa"/>
@@ -1940,12 +1768,6 @@
         </w:tc>
       </w:tr>
       <w:tr>
-        <w:tblPrEx>
-          <w:tblCellMar>
-            <w:top w:w="0" w:type="dxa"/>
-            <w:bottom w:w="0" w:type="dxa"/>
-          </w:tblCellMar>
-        </w:tblPrEx>
         <w:tc>
           <w:tcPr>
             <w:tcW w:w="2200" w:type="dxa"/>
@@ -2001,12 +1823,6 @@
         </w:tc>
       </w:tr>
       <w:tr>
-        <w:tblPrEx>
-          <w:tblCellMar>
-            <w:top w:w="0" w:type="dxa"/>
-            <w:bottom w:w="0" w:type="dxa"/>
-          </w:tblCellMar>
-        </w:tblPrEx>
         <w:tc>
           <w:tcPr>
             <w:tcW w:w="2200" w:type="dxa"/>
@@ -2084,31 +1900,7 @@
         <w:spacing w:after="130" w:line="275" w:lineRule="auto"/>
       </w:pPr>
       <w:r>
-        <w:t xml:space="preserve">User </w:t>
-      </w:r>
-      <w:proofErr w:type="spellStart"/>
-      <w:r>
-        <w:t>qauser@finserve.test</w:t>
-      </w:r>
-      <w:proofErr w:type="spellEnd"/>
-      <w:r>
-        <w:t xml:space="preserve"> on FinServe Retail. Product FSLIFE002, FinServe Secure Future Term Plan, published with an eligible age of 18 to 55 years. The values </w:t>
-      </w:r>
-      <w:proofErr w:type="spellStart"/>
-      <w:r>
-        <w:t>eligibility_age_min</w:t>
-      </w:r>
-      <w:proofErr w:type="spellEnd"/>
-      <w:r>
-        <w:t xml:space="preserve"> 18 and </w:t>
-      </w:r>
-      <w:proofErr w:type="spellStart"/>
-      <w:r>
-        <w:t>eligibility_age_max</w:t>
-      </w:r>
-      <w:proofErr w:type="spellEnd"/>
-      <w:r>
-        <w:t xml:space="preserve"> 55 are held on the product record. Dates of birth used give ages of 56 and 17 as of the test date. No defect flag is exposed.</w:t>
+        <w:t>User qauser@finserve.test on FinServe Retail. Product FSLIFE002, FinServe Secure Future Term Plan, published with an eligible age of 18 to 55 years. The values eligibility_age_min 18 and eligibility_age_max 55 are held on the product record. Dates of birth used give ages of 56 and 17 as of the test date. No defect flag is exposed.</w:t>
       </w:r>
     </w:p>
     <w:p>
@@ -2177,7 +1969,15 @@
         <w:spacing w:after="50" w:line="265" w:lineRule="auto"/>
       </w:pPr>
       <w:r>
-        <w:t>Complete the nominee details and accept the declaration</w:t>
+        <w:t xml:space="preserve">Complete the </w:t>
+      </w:r>
+      <w:proofErr w:type="gramStart"/>
+      <w:r>
+        <w:t>nominee</w:t>
+      </w:r>
+      <w:proofErr w:type="gramEnd"/>
+      <w:r>
+        <w:t xml:space="preserve"> details and accept the declaration</w:t>
       </w:r>
     </w:p>
     <w:p>
@@ -2266,7 +2066,15 @@
         <w:spacing w:after="130" w:line="275" w:lineRule="auto"/>
       </w:pPr>
       <w:r>
-        <w:t>Both purchases completed. The confirmation read Policy Created Successfully in each case, and both policies appear in /policies with status Active.</w:t>
+        <w:t xml:space="preserve">Both purchases </w:t>
+      </w:r>
+      <w:proofErr w:type="gramStart"/>
+      <w:r>
+        <w:t>completed</w:t>
+      </w:r>
+      <w:proofErr w:type="gramEnd"/>
+      <w:r>
+        <w:t>. The confirmation read Policy Created Successfully in each case, and both policies appear in /policies with status Active.</w:t>
       </w:r>
     </w:p>
     <w:p>
@@ -2291,187 +2099,22 @@
         <w:spacing w:after="130" w:line="275" w:lineRule="auto"/>
       </w:pPr>
       <w:r>
-        <w:t>Policies are issued outside the product’s own eligibility terms. A policy sold to a minor is not a binding contract, so premiums would be collected for cover that could be void at the point a claim is made. For the over-age case, the insurer is on risk for a life it never agreed to underwrite. Both are compliance exposures rather than display faults.</w:t>
-      </w:r>
-    </w:p>
-    <w:p>
-      <w:pPr>
-        <w:spacing w:before="180" w:after="60"/>
-      </w:pPr>
-      <w:r>
-        <w:rPr>
-          <w:b/>
-          <w:bCs/>
-          <w:caps/>
-          <w:color w:val="B5522B"/>
-          <w:spacing w:val="20"/>
-          <w:sz w:val="19"/>
-          <w:szCs w:val="19"/>
-        </w:rPr>
-        <w:t>Evidence</w:t>
-      </w:r>
-    </w:p>
-    <w:p>
-      <w:pPr>
-        <w:spacing w:after="80" w:line="275" w:lineRule="auto"/>
-      </w:pPr>
-    </w:p>
-    <w:tbl>
-      <w:tblPr>
-        <w:tblW w:w="9200" w:type="dxa"/>
-        <w:tblBorders>
-          <w:top w:val="dashed" w:sz="6" w:space="0" w:color="B5522B"/>
-          <w:left w:val="dashed" w:sz="6" w:space="0" w:color="B5522B"/>
-          <w:bottom w:val="dashed" w:sz="6" w:space="0" w:color="B5522B"/>
-          <w:right w:val="dashed" w:sz="6" w:space="0" w:color="B5522B"/>
-          <w:insideH w:val="none" w:sz="0" w:space="0" w:color="FFFFFF"/>
-          <w:insideV w:val="none" w:sz="0" w:space="0" w:color="FFFFFF"/>
-        </w:tblBorders>
-        <w:tblCellMar>
-          <w:left w:w="10" w:type="dxa"/>
-          <w:right w:w="10" w:type="dxa"/>
-        </w:tblCellMar>
-        <w:tblLook w:val="0000" w:firstRow="0" w:lastRow="0" w:firstColumn="0" w:lastColumn="0" w:noHBand="0" w:noVBand="0"/>
-      </w:tblPr>
-      <w:tblGrid>
-        <w:gridCol w:w="9200"/>
-      </w:tblGrid>
-      <w:tr>
-        <w:tblPrEx>
-          <w:tblCellMar>
-            <w:top w:w="0" w:type="dxa"/>
-            <w:bottom w:w="0" w:type="dxa"/>
-          </w:tblCellMar>
-        </w:tblPrEx>
-        <w:tc>
-          <w:tcPr>
-            <w:tcW w:w="9200" w:type="dxa"/>
-            <w:shd w:val="clear" w:color="auto" w:fill="FBF3E4"/>
-            <w:tcMar>
-              <w:top w:w="200" w:type="dxa"/>
-              <w:left w:w="200" w:type="dxa"/>
-              <w:bottom w:w="200" w:type="dxa"/>
-              <w:right w:w="200" w:type="dxa"/>
-            </w:tcMar>
-          </w:tcPr>
-          <w:p>
-            <w:pPr>
-              <w:jc w:val="center"/>
-            </w:pPr>
-            <w:r>
-              <w:rPr>
-                <w:b/>
-                <w:bCs/>
-                <w:caps/>
-                <w:color w:val="B5522B"/>
-                <w:spacing w:val="20"/>
-                <w:sz w:val="19"/>
-                <w:szCs w:val="19"/>
-              </w:rPr>
-              <w:t>Screenshot pending. The original failure is recorded in the attached Playwright report.</w:t>
-            </w:r>
-          </w:p>
-        </w:tc>
-      </w:tr>
-    </w:tbl>
+        <w:t xml:space="preserve">Policies are issued outside the product’s own eligibility terms. A policy sold to a minor is not a binding contract, so premiums would be collected for cover that could be void at the point a claim is made. For the over-age case, the insurer is </w:t>
+      </w:r>
+      <w:proofErr w:type="gramStart"/>
+      <w:r>
+        <w:t>on</w:t>
+      </w:r>
+      <w:proofErr w:type="gramEnd"/>
+      <w:r>
+        <w:t xml:space="preserve"> risk for a life it never agreed to underwrite. Both are compliance exposures rather than display faults.</w:t>
+      </w:r>
+    </w:p>
     <w:p>
       <w:pPr>
         <w:spacing w:after="120" w:line="275" w:lineRule="auto"/>
       </w:pPr>
     </w:p>
-    <w:tbl>
-      <w:tblPr>
-        <w:tblW w:w="9200" w:type="dxa"/>
-        <w:tblBorders>
-          <w:top w:val="dashed" w:sz="6" w:space="0" w:color="B5522B"/>
-          <w:left w:val="dashed" w:sz="6" w:space="0" w:color="B5522B"/>
-          <w:bottom w:val="dashed" w:sz="6" w:space="0" w:color="B5522B"/>
-          <w:right w:val="dashed" w:sz="6" w:space="0" w:color="B5522B"/>
-          <w:insideH w:val="none" w:sz="0" w:space="0" w:color="FFFFFF"/>
-          <w:insideV w:val="none" w:sz="0" w:space="0" w:color="FFFFFF"/>
-        </w:tblBorders>
-        <w:tblCellMar>
-          <w:left w:w="10" w:type="dxa"/>
-          <w:right w:w="10" w:type="dxa"/>
-        </w:tblCellMar>
-        <w:tblLook w:val="0000" w:firstRow="0" w:lastRow="0" w:firstColumn="0" w:lastColumn="0" w:noHBand="0" w:noVBand="0"/>
-      </w:tblPr>
-      <w:tblGrid>
-        <w:gridCol w:w="9200"/>
-      </w:tblGrid>
-      <w:tr>
-        <w:tblPrEx>
-          <w:tblCellMar>
-            <w:top w:w="0" w:type="dxa"/>
-            <w:bottom w:w="0" w:type="dxa"/>
-          </w:tblCellMar>
-        </w:tblPrEx>
-        <w:tc>
-          <w:tcPr>
-            <w:tcW w:w="9200" w:type="dxa"/>
-            <w:shd w:val="clear" w:color="auto" w:fill="FBF3E4"/>
-            <w:tcMar>
-              <w:top w:w="200" w:type="dxa"/>
-              <w:left w:w="200" w:type="dxa"/>
-              <w:bottom w:w="200" w:type="dxa"/>
-              <w:right w:w="200" w:type="dxa"/>
-            </w:tcMar>
-          </w:tcPr>
-          <w:p>
-            <w:pPr>
-              <w:jc w:val="center"/>
-            </w:pPr>
-            <w:r>
-              <w:rPr>
-                <w:b/>
-                <w:bCs/>
-                <w:caps/>
-                <w:color w:val="B5522B"/>
-                <w:spacing w:val="20"/>
-                <w:sz w:val="19"/>
-                <w:szCs w:val="19"/>
-              </w:rPr>
-              <w:lastRenderedPageBreak/>
-              <w:t xml:space="preserve">Screenshot pending. The original failure is recorded in the attached Playwright </w:t>
-            </w:r>
-            <w:proofErr w:type="spellStart"/>
-            <w:r>
-              <w:rPr>
-                <w:b/>
-                <w:bCs/>
-                <w:caps/>
-                <w:color w:val="B5522B"/>
-                <w:spacing w:val="20"/>
-                <w:sz w:val="19"/>
-                <w:szCs w:val="19"/>
-              </w:rPr>
-              <w:t>report.</w:t>
-            </w:r>
-            <w:r>
-              <w:rPr>
-                <w:i/>
-                <w:iCs/>
-                <w:color w:val="8A8073"/>
-                <w:sz w:val="19"/>
-                <w:szCs w:val="19"/>
-              </w:rPr>
-              <w:t>The</w:t>
-            </w:r>
-            <w:proofErr w:type="spellEnd"/>
-            <w:r>
-              <w:rPr>
-                <w:i/>
-                <w:iCs/>
-                <w:color w:val="8A8073"/>
-                <w:sz w:val="19"/>
-                <w:szCs w:val="19"/>
-              </w:rPr>
-              <w:t xml:space="preserve"> policies list showing both Active policies created outside that range</w:t>
-            </w:r>
-          </w:p>
-        </w:tc>
-      </w:tr>
-    </w:tbl>
     <w:p>
       <w:r>
         <w:br w:type="page"/>
@@ -2527,12 +2170,6 @@
         <w:gridCol w:w="7000"/>
       </w:tblGrid>
       <w:tr>
-        <w:tblPrEx>
-          <w:tblCellMar>
-            <w:top w:w="0" w:type="dxa"/>
-            <w:bottom w:w="0" w:type="dxa"/>
-          </w:tblCellMar>
-        </w:tblPrEx>
         <w:tc>
           <w:tcPr>
             <w:tcW w:w="2200" w:type="dxa"/>
@@ -2588,12 +2225,6 @@
         </w:tc>
       </w:tr>
       <w:tr>
-        <w:tblPrEx>
-          <w:tblCellMar>
-            <w:top w:w="0" w:type="dxa"/>
-            <w:bottom w:w="0" w:type="dxa"/>
-          </w:tblCellMar>
-        </w:tblPrEx>
         <w:tc>
           <w:tcPr>
             <w:tcW w:w="2200" w:type="dxa"/>
@@ -2652,12 +2283,6 @@
         </w:tc>
       </w:tr>
       <w:tr>
-        <w:tblPrEx>
-          <w:tblCellMar>
-            <w:top w:w="0" w:type="dxa"/>
-            <w:bottom w:w="0" w:type="dxa"/>
-          </w:tblCellMar>
-        </w:tblPrEx>
         <w:tc>
           <w:tcPr>
             <w:tcW w:w="2200" w:type="dxa"/>
@@ -2713,12 +2338,6 @@
         </w:tc>
       </w:tr>
       <w:tr>
-        <w:tblPrEx>
-          <w:tblCellMar>
-            <w:top w:w="0" w:type="dxa"/>
-            <w:bottom w:w="0" w:type="dxa"/>
-          </w:tblCellMar>
-        </w:tblPrEx>
         <w:tc>
           <w:tcPr>
             <w:tcW w:w="2200" w:type="dxa"/>
@@ -2774,12 +2393,6 @@
         </w:tc>
       </w:tr>
       <w:tr>
-        <w:tblPrEx>
-          <w:tblCellMar>
-            <w:top w:w="0" w:type="dxa"/>
-            <w:bottom w:w="0" w:type="dxa"/>
-          </w:tblCellMar>
-        </w:tblPrEx>
         <w:tc>
           <w:tcPr>
             <w:tcW w:w="2200" w:type="dxa"/>
@@ -2857,15 +2470,7 @@
         <w:spacing w:after="130" w:line="275" w:lineRule="auto"/>
       </w:pPr>
       <w:r>
-        <w:t xml:space="preserve">Registered agent on Insurance Order Entry, port 8081. A draft application with one or more incomplete steps. No defect flag is exposed; the </w:t>
-      </w:r>
-      <w:proofErr w:type="spellStart"/>
-      <w:r>
-        <w:t>behaviour</w:t>
-      </w:r>
-      <w:proofErr w:type="spellEnd"/>
-      <w:r>
-        <w:t xml:space="preserve"> follows from the markup, where Continue controls are anchor elements rather than form submit buttons.</w:t>
+        <w:t>Registered agent on Insurance Order Entry, port 8081. A draft application with one or more incomplete steps. No defect flag is exposed; the behaviour follows from the markup, where Continue controls are anchor elements rather than form submit buttons.</w:t>
       </w:r>
     </w:p>
     <w:p>
@@ -3025,102 +2630,6 @@
         <w:t>An agent can work through the entire wizard entering almost nothing, and the sequence gives false confidence that each step was accepted as it was completed. An application can reach submission with no supporting documents at all, which underwriting would then have to chase.</w:t>
       </w:r>
     </w:p>
-    <w:p>
-      <w:pPr>
-        <w:spacing w:before="180" w:after="60"/>
-      </w:pPr>
-      <w:r>
-        <w:rPr>
-          <w:b/>
-          <w:bCs/>
-          <w:caps/>
-          <w:color w:val="B5522B"/>
-          <w:spacing w:val="20"/>
-          <w:sz w:val="19"/>
-          <w:szCs w:val="19"/>
-        </w:rPr>
-        <w:t>Evidence</w:t>
-      </w:r>
-    </w:p>
-    <w:p>
-      <w:pPr>
-        <w:spacing w:after="80" w:line="275" w:lineRule="auto"/>
-      </w:pPr>
-    </w:p>
-    <w:tbl>
-      <w:tblPr>
-        <w:tblW w:w="9200" w:type="dxa"/>
-        <w:tblBorders>
-          <w:top w:val="dashed" w:sz="6" w:space="0" w:color="B5522B"/>
-          <w:left w:val="dashed" w:sz="6" w:space="0" w:color="B5522B"/>
-          <w:bottom w:val="dashed" w:sz="6" w:space="0" w:color="B5522B"/>
-          <w:right w:val="dashed" w:sz="6" w:space="0" w:color="B5522B"/>
-          <w:insideH w:val="none" w:sz="0" w:space="0" w:color="FFFFFF"/>
-          <w:insideV w:val="none" w:sz="0" w:space="0" w:color="FFFFFF"/>
-        </w:tblBorders>
-        <w:tblCellMar>
-          <w:left w:w="10" w:type="dxa"/>
-          <w:right w:w="10" w:type="dxa"/>
-        </w:tblCellMar>
-        <w:tblLook w:val="0000" w:firstRow="0" w:lastRow="0" w:firstColumn="0" w:lastColumn="0" w:noHBand="0" w:noVBand="0"/>
-      </w:tblPr>
-      <w:tblGrid>
-        <w:gridCol w:w="9200"/>
-      </w:tblGrid>
-      <w:tr>
-        <w:tblPrEx>
-          <w:tblCellMar>
-            <w:top w:w="0" w:type="dxa"/>
-            <w:bottom w:w="0" w:type="dxa"/>
-          </w:tblCellMar>
-        </w:tblPrEx>
-        <w:tc>
-          <w:tcPr>
-            <w:tcW w:w="9200" w:type="dxa"/>
-            <w:shd w:val="clear" w:color="auto" w:fill="FBF3E4"/>
-            <w:tcMar>
-              <w:top w:w="200" w:type="dxa"/>
-              <w:left w:w="200" w:type="dxa"/>
-              <w:bottom w:w="200" w:type="dxa"/>
-              <w:right w:w="200" w:type="dxa"/>
-            </w:tcMar>
-          </w:tcPr>
-          <w:p>
-            <w:pPr>
-              <w:spacing w:after="60"/>
-              <w:jc w:val="center"/>
-            </w:pPr>
-            <w:r>
-              <w:rPr>
-                <w:b/>
-                <w:bCs/>
-                <w:caps/>
-                <w:color w:val="B5522B"/>
-                <w:spacing w:val="20"/>
-                <w:sz w:val="19"/>
-                <w:szCs w:val="19"/>
-              </w:rPr>
-              <w:t>PASTE SCREENSHOT HERE</w:t>
-            </w:r>
-          </w:p>
-          <w:p>
-            <w:pPr>
-              <w:jc w:val="center"/>
-            </w:pPr>
-            <w:r>
-              <w:rPr>
-                <w:i/>
-                <w:iCs/>
-                <w:color w:val="8A8073"/>
-                <w:sz w:val="19"/>
-                <w:szCs w:val="19"/>
-              </w:rPr>
-              <w:t>The documents step showing no uploads, and the review step reached immediately afterwards</w:t>
-            </w:r>
-          </w:p>
-        </w:tc>
-      </w:tr>
-    </w:tbl>
     <w:p>
       <w:r>
         <w:br w:type="page"/>
@@ -3176,12 +2685,6 @@
         <w:gridCol w:w="7000"/>
       </w:tblGrid>
       <w:tr>
-        <w:tblPrEx>
-          <w:tblCellMar>
-            <w:top w:w="0" w:type="dxa"/>
-            <w:bottom w:w="0" w:type="dxa"/>
-          </w:tblCellMar>
-        </w:tblPrEx>
         <w:tc>
           <w:tcPr>
             <w:tcW w:w="2200" w:type="dxa"/>
@@ -3237,12 +2740,6 @@
         </w:tc>
       </w:tr>
       <w:tr>
-        <w:tblPrEx>
-          <w:tblCellMar>
-            <w:top w:w="0" w:type="dxa"/>
-            <w:bottom w:w="0" w:type="dxa"/>
-          </w:tblCellMar>
-        </w:tblPrEx>
         <w:tc>
           <w:tcPr>
             <w:tcW w:w="2200" w:type="dxa"/>
@@ -3301,12 +2798,6 @@
         </w:tc>
       </w:tr>
       <w:tr>
-        <w:tblPrEx>
-          <w:tblCellMar>
-            <w:top w:w="0" w:type="dxa"/>
-            <w:bottom w:w="0" w:type="dxa"/>
-          </w:tblCellMar>
-        </w:tblPrEx>
         <w:tc>
           <w:tcPr>
             <w:tcW w:w="2200" w:type="dxa"/>
@@ -3362,12 +2853,6 @@
         </w:tc>
       </w:tr>
       <w:tr>
-        <w:tblPrEx>
-          <w:tblCellMar>
-            <w:top w:w="0" w:type="dxa"/>
-            <w:bottom w:w="0" w:type="dxa"/>
-          </w:tblCellMar>
-        </w:tblPrEx>
         <w:tc>
           <w:tcPr>
             <w:tcW w:w="2200" w:type="dxa"/>
@@ -3423,12 +2908,6 @@
         </w:tc>
       </w:tr>
       <w:tr>
-        <w:tblPrEx>
-          <w:tblCellMar>
-            <w:top w:w="0" w:type="dxa"/>
-            <w:bottom w:w="0" w:type="dxa"/>
-          </w:tblCellMar>
-        </w:tblPrEx>
         <w:tc>
           <w:tcPr>
             <w:tcW w:w="2200" w:type="dxa"/>
@@ -3549,7 +3028,15 @@
         <w:spacing w:after="50" w:line="265" w:lineRule="auto"/>
       </w:pPr>
       <w:r>
-        <w:t>Go to the beneficiaries step and note the allocation summary reads 0.00%</w:t>
+        <w:t xml:space="preserve">Go to the </w:t>
+      </w:r>
+      <w:proofErr w:type="gramStart"/>
+      <w:r>
+        <w:t>beneficiaries</w:t>
+      </w:r>
+      <w:proofErr w:type="gramEnd"/>
+      <w:r>
+        <w:t xml:space="preserve"> step and note the allocation summary reads 0.00%</w:t>
       </w:r>
     </w:p>
     <w:p>
@@ -3664,7 +3151,15 @@
         <w:spacing w:after="130" w:line="275" w:lineRule="auto"/>
       </w:pPr>
       <w:r>
-        <w:t>Validation returned Application validation passed and No blocking validation errors found. Submit Application was enabled and the application was submitted successfully with reference WL2026090364621, carrying an allocation of 60%. The rule is not enforced at the beneficiary step, at review, or at submission.</w:t>
+        <w:t xml:space="preserve">Validation returned Application validation </w:t>
+      </w:r>
+      <w:proofErr w:type="gramStart"/>
+      <w:r>
+        <w:t>passed</w:t>
+      </w:r>
+      <w:proofErr w:type="gramEnd"/>
+      <w:r>
+        <w:t xml:space="preserve"> and No blocking validation errors found. Submit Application was enabled and the application was submitted successfully with reference WL2026090364621, carrying an allocation of 60%. The rule is not enforced at the beneficiary step, at review, or at submission.</w:t>
       </w:r>
     </w:p>
     <w:p>
@@ -3694,264 +3189,10 @@
     </w:p>
     <w:p>
       <w:pPr>
-        <w:spacing w:before="180" w:after="60"/>
-      </w:pPr>
-      <w:r>
-        <w:rPr>
-          <w:b/>
-          <w:bCs/>
-          <w:caps/>
-          <w:color w:val="B5522B"/>
-          <w:spacing w:val="20"/>
-          <w:sz w:val="19"/>
-          <w:szCs w:val="19"/>
-        </w:rPr>
-        <w:t>Evidence</w:t>
-      </w:r>
-    </w:p>
-    <w:p>
-      <w:pPr>
-        <w:spacing w:after="80" w:line="275" w:lineRule="auto"/>
-      </w:pPr>
-    </w:p>
-    <w:tbl>
-      <w:tblPr>
-        <w:tblW w:w="9200" w:type="dxa"/>
-        <w:tblBorders>
-          <w:top w:val="dashed" w:sz="6" w:space="0" w:color="B5522B"/>
-          <w:left w:val="dashed" w:sz="6" w:space="0" w:color="B5522B"/>
-          <w:bottom w:val="dashed" w:sz="6" w:space="0" w:color="B5522B"/>
-          <w:right w:val="dashed" w:sz="6" w:space="0" w:color="B5522B"/>
-          <w:insideH w:val="none" w:sz="0" w:space="0" w:color="FFFFFF"/>
-          <w:insideV w:val="none" w:sz="0" w:space="0" w:color="FFFFFF"/>
-        </w:tblBorders>
-        <w:tblCellMar>
-          <w:left w:w="10" w:type="dxa"/>
-          <w:right w:w="10" w:type="dxa"/>
-        </w:tblCellMar>
-        <w:tblLook w:val="0000" w:firstRow="0" w:lastRow="0" w:firstColumn="0" w:lastColumn="0" w:noHBand="0" w:noVBand="0"/>
-      </w:tblPr>
-      <w:tblGrid>
-        <w:gridCol w:w="9200"/>
-      </w:tblGrid>
-      <w:tr>
-        <w:tblPrEx>
-          <w:tblCellMar>
-            <w:top w:w="0" w:type="dxa"/>
-            <w:bottom w:w="0" w:type="dxa"/>
-          </w:tblCellMar>
-        </w:tblPrEx>
-        <w:tc>
-          <w:tcPr>
-            <w:tcW w:w="9200" w:type="dxa"/>
-            <w:shd w:val="clear" w:color="auto" w:fill="FBF3E4"/>
-            <w:tcMar>
-              <w:top w:w="200" w:type="dxa"/>
-              <w:left w:w="200" w:type="dxa"/>
-              <w:bottom w:w="200" w:type="dxa"/>
-              <w:right w:w="200" w:type="dxa"/>
-            </w:tcMar>
-          </w:tcPr>
-          <w:p>
-            <w:pPr>
-              <w:spacing w:after="60"/>
-              <w:jc w:val="center"/>
-            </w:pPr>
-            <w:r>
-              <w:rPr>
-                <w:b/>
-                <w:bCs/>
-                <w:caps/>
-                <w:color w:val="B5522B"/>
-                <w:spacing w:val="20"/>
-                <w:sz w:val="19"/>
-                <w:szCs w:val="19"/>
-              </w:rPr>
-              <w:t>PASTE SCREENSHOT HERE</w:t>
-            </w:r>
-          </w:p>
-          <w:p>
-            <w:pPr>
-              <w:jc w:val="center"/>
-            </w:pPr>
-            <w:r>
-              <w:rPr>
-                <w:i/>
-                <w:iCs/>
-                <w:color w:val="8A8073"/>
-                <w:sz w:val="19"/>
-                <w:szCs w:val="19"/>
-              </w:rPr>
-              <w:t>The beneficiaries step showing Primary allocation 60.00%</w:t>
-            </w:r>
-          </w:p>
-        </w:tc>
-      </w:tr>
-    </w:tbl>
-    <w:p>
-      <w:pPr>
         <w:spacing w:after="120" w:line="275" w:lineRule="auto"/>
       </w:pPr>
     </w:p>
-    <w:tbl>
-      <w:tblPr>
-        <w:tblW w:w="9200" w:type="dxa"/>
-        <w:tblBorders>
-          <w:top w:val="dashed" w:sz="6" w:space="0" w:color="B5522B"/>
-          <w:left w:val="dashed" w:sz="6" w:space="0" w:color="B5522B"/>
-          <w:bottom w:val="dashed" w:sz="6" w:space="0" w:color="B5522B"/>
-          <w:right w:val="dashed" w:sz="6" w:space="0" w:color="B5522B"/>
-          <w:insideH w:val="none" w:sz="0" w:space="0" w:color="FFFFFF"/>
-          <w:insideV w:val="none" w:sz="0" w:space="0" w:color="FFFFFF"/>
-        </w:tblBorders>
-        <w:tblCellMar>
-          <w:left w:w="10" w:type="dxa"/>
-          <w:right w:w="10" w:type="dxa"/>
-        </w:tblCellMar>
-        <w:tblLook w:val="0000" w:firstRow="0" w:lastRow="0" w:firstColumn="0" w:lastColumn="0" w:noHBand="0" w:noVBand="0"/>
-      </w:tblPr>
-      <w:tblGrid>
-        <w:gridCol w:w="9200"/>
-      </w:tblGrid>
-      <w:tr>
-        <w:tblPrEx>
-          <w:tblCellMar>
-            <w:top w:w="0" w:type="dxa"/>
-            <w:bottom w:w="0" w:type="dxa"/>
-          </w:tblCellMar>
-        </w:tblPrEx>
-        <w:tc>
-          <w:tcPr>
-            <w:tcW w:w="9200" w:type="dxa"/>
-            <w:shd w:val="clear" w:color="auto" w:fill="FBF3E4"/>
-            <w:tcMar>
-              <w:top w:w="200" w:type="dxa"/>
-              <w:left w:w="200" w:type="dxa"/>
-              <w:bottom w:w="200" w:type="dxa"/>
-              <w:right w:w="200" w:type="dxa"/>
-            </w:tcMar>
-          </w:tcPr>
-          <w:p>
-            <w:pPr>
-              <w:spacing w:after="60"/>
-              <w:jc w:val="center"/>
-            </w:pPr>
-            <w:r>
-              <w:rPr>
-                <w:b/>
-                <w:bCs/>
-                <w:caps/>
-                <w:color w:val="B5522B"/>
-                <w:spacing w:val="20"/>
-                <w:sz w:val="19"/>
-                <w:szCs w:val="19"/>
-              </w:rPr>
-              <w:t>PASTE SCREENSHOT HERE</w:t>
-            </w:r>
-          </w:p>
-          <w:p>
-            <w:pPr>
-              <w:jc w:val="center"/>
-            </w:pPr>
-            <w:r>
-              <w:rPr>
-                <w:i/>
-                <w:iCs/>
-                <w:color w:val="8A8073"/>
-                <w:sz w:val="19"/>
-                <w:szCs w:val="19"/>
-              </w:rPr>
-              <w:lastRenderedPageBreak/>
-              <w:t>The review step reporting no blocking validation errors</w:t>
-            </w:r>
-          </w:p>
-        </w:tc>
-      </w:tr>
-    </w:tbl>
-    <w:p>
-      <w:pPr>
-        <w:spacing w:after="120" w:line="275" w:lineRule="auto"/>
-      </w:pPr>
-    </w:p>
-    <w:tbl>
-      <w:tblPr>
-        <w:tblW w:w="9200" w:type="dxa"/>
-        <w:tblBorders>
-          <w:top w:val="dashed" w:sz="6" w:space="0" w:color="B5522B"/>
-          <w:left w:val="dashed" w:sz="6" w:space="0" w:color="B5522B"/>
-          <w:bottom w:val="dashed" w:sz="6" w:space="0" w:color="B5522B"/>
-          <w:right w:val="dashed" w:sz="6" w:space="0" w:color="B5522B"/>
-          <w:insideH w:val="none" w:sz="0" w:space="0" w:color="FFFFFF"/>
-          <w:insideV w:val="none" w:sz="0" w:space="0" w:color="FFFFFF"/>
-        </w:tblBorders>
-        <w:tblCellMar>
-          <w:left w:w="10" w:type="dxa"/>
-          <w:right w:w="10" w:type="dxa"/>
-        </w:tblCellMar>
-        <w:tblLook w:val="0000" w:firstRow="0" w:lastRow="0" w:firstColumn="0" w:lastColumn="0" w:noHBand="0" w:noVBand="0"/>
-      </w:tblPr>
-      <w:tblGrid>
-        <w:gridCol w:w="9200"/>
-      </w:tblGrid>
-      <w:tr>
-        <w:tblPrEx>
-          <w:tblCellMar>
-            <w:top w:w="0" w:type="dxa"/>
-            <w:bottom w:w="0" w:type="dxa"/>
-          </w:tblCellMar>
-        </w:tblPrEx>
-        <w:tc>
-          <w:tcPr>
-            <w:tcW w:w="9200" w:type="dxa"/>
-            <w:shd w:val="clear" w:color="auto" w:fill="FBF3E4"/>
-            <w:tcMar>
-              <w:top w:w="200" w:type="dxa"/>
-              <w:left w:w="200" w:type="dxa"/>
-              <w:bottom w:w="200" w:type="dxa"/>
-              <w:right w:w="200" w:type="dxa"/>
-            </w:tcMar>
-          </w:tcPr>
-          <w:p>
-            <w:pPr>
-              <w:spacing w:after="60"/>
-              <w:jc w:val="center"/>
-            </w:pPr>
-            <w:r>
-              <w:rPr>
-                <w:b/>
-                <w:bCs/>
-                <w:caps/>
-                <w:color w:val="B5522B"/>
-                <w:spacing w:val="20"/>
-                <w:sz w:val="19"/>
-                <w:szCs w:val="19"/>
-              </w:rPr>
-              <w:t>PASTE SCREENSHOT HERE</w:t>
-            </w:r>
-          </w:p>
-          <w:p>
-            <w:pPr>
-              <w:jc w:val="center"/>
-            </w:pPr>
-            <w:r>
-              <w:rPr>
-                <w:i/>
-                <w:iCs/>
-                <w:color w:val="8A8073"/>
-                <w:sz w:val="19"/>
-                <w:szCs w:val="19"/>
-              </w:rPr>
-              <w:t>The dashboard showing WL2026090364621 with status SUBMITTED</w:t>
-            </w:r>
-          </w:p>
-        </w:tc>
-      </w:tr>
-    </w:tbl>
-    <w:p>
-      <w:r>
-        <w:br w:type="page"/>
-      </w:r>
-    </w:p>
+    <w:p/>
     <w:p>
       <w:pPr>
         <w:pBdr>
@@ -3968,7 +3209,6 @@
           <w:sz w:val="24"/>
           <w:szCs w:val="24"/>
         </w:rPr>
-        <w:lastRenderedPageBreak/>
         <w:t xml:space="preserve">DEF-06   </w:t>
       </w:r>
       <w:r>
@@ -4002,12 +3242,6 @@
         <w:gridCol w:w="7000"/>
       </w:tblGrid>
       <w:tr>
-        <w:tblPrEx>
-          <w:tblCellMar>
-            <w:top w:w="0" w:type="dxa"/>
-            <w:bottom w:w="0" w:type="dxa"/>
-          </w:tblCellMar>
-        </w:tblPrEx>
         <w:tc>
           <w:tcPr>
             <w:tcW w:w="2200" w:type="dxa"/>
@@ -4063,12 +3297,6 @@
         </w:tc>
       </w:tr>
       <w:tr>
-        <w:tblPrEx>
-          <w:tblCellMar>
-            <w:top w:w="0" w:type="dxa"/>
-            <w:bottom w:w="0" w:type="dxa"/>
-          </w:tblCellMar>
-        </w:tblPrEx>
         <w:tc>
           <w:tcPr>
             <w:tcW w:w="2200" w:type="dxa"/>
@@ -4127,12 +3355,6 @@
         </w:tc>
       </w:tr>
       <w:tr>
-        <w:tblPrEx>
-          <w:tblCellMar>
-            <w:top w:w="0" w:type="dxa"/>
-            <w:bottom w:w="0" w:type="dxa"/>
-          </w:tblCellMar>
-        </w:tblPrEx>
         <w:tc>
           <w:tcPr>
             <w:tcW w:w="2200" w:type="dxa"/>
@@ -4188,12 +3410,6 @@
         </w:tc>
       </w:tr>
       <w:tr>
-        <w:tblPrEx>
-          <w:tblCellMar>
-            <w:top w:w="0" w:type="dxa"/>
-            <w:bottom w:w="0" w:type="dxa"/>
-          </w:tblCellMar>
-        </w:tblPrEx>
         <w:tc>
           <w:tcPr>
             <w:tcW w:w="2200" w:type="dxa"/>
@@ -4217,6 +3433,7 @@
                 <w:sz w:val="19"/>
                 <w:szCs w:val="19"/>
               </w:rPr>
+              <w:lastRenderedPageBreak/>
               <w:t>Status</w:t>
             </w:r>
           </w:p>
@@ -4243,27 +3460,12 @@
                 <w:sz w:val="20"/>
                 <w:szCs w:val="20"/>
               </w:rPr>
-              <w:t xml:space="preserve">Open, needs </w:t>
-            </w:r>
-            <w:proofErr w:type="spellStart"/>
-            <w:r>
-              <w:rPr>
-                <w:sz w:val="20"/>
-                <w:szCs w:val="20"/>
-              </w:rPr>
-              <w:t>characterising</w:t>
-            </w:r>
-            <w:proofErr w:type="spellEnd"/>
+              <w:t>Open, needs characterising</w:t>
+            </w:r>
           </w:p>
         </w:tc>
       </w:tr>
       <w:tr>
-        <w:tblPrEx>
-          <w:tblCellMar>
-            <w:top w:w="0" w:type="dxa"/>
-            <w:bottom w:w="0" w:type="dxa"/>
-          </w:tblCellMar>
-        </w:tblPrEx>
         <w:tc>
           <w:tcPr>
             <w:tcW w:w="2200" w:type="dxa"/>
@@ -4410,8 +3612,13 @@
         <w:spacing w:after="50" w:line="265" w:lineRule="auto"/>
       </w:pPr>
       <w:r>
-        <w:t>Open the review step</w:t>
-      </w:r>
+        <w:t xml:space="preserve">Open the review </w:t>
+      </w:r>
+      <w:proofErr w:type="gramStart"/>
+      <w:r>
+        <w:t>step</w:t>
+      </w:r>
+      <w:proofErr w:type="gramEnd"/>
     </w:p>
     <w:p>
       <w:pPr>
@@ -4448,7 +3655,15 @@
         <w:spacing w:after="130" w:line="275" w:lineRule="auto"/>
       </w:pPr>
       <w:r>
-        <w:t>Calculated Age is 46. The birthday falls in January and had passed by the test date.</w:t>
+        <w:t xml:space="preserve">Calculated Age is 46. The birthday falls in January and </w:t>
+      </w:r>
+      <w:proofErr w:type="gramStart"/>
+      <w:r>
+        <w:t>had passed</w:t>
+      </w:r>
+      <w:proofErr w:type="gramEnd"/>
+      <w:r>
+        <w:t xml:space="preserve"> by the test date.</w:t>
       </w:r>
     </w:p>
     <w:p>
@@ -4500,104 +3715,6 @@
       <w:r>
         <w:t>Age drives the eligible age check and, on many life products, the premium band. An off-by-one means an applicant at either boundary is accepted or refused wrongly, and any age-based rate is applied from the wrong band.</w:t>
       </w:r>
-    </w:p>
-    <w:p>
-      <w:pPr>
-        <w:spacing w:before="180" w:after="60"/>
-      </w:pPr>
-      <w:r>
-        <w:rPr>
-          <w:b/>
-          <w:bCs/>
-          <w:caps/>
-          <w:color w:val="B5522B"/>
-          <w:spacing w:val="20"/>
-          <w:sz w:val="19"/>
-          <w:szCs w:val="19"/>
-        </w:rPr>
-        <w:t>Evidence</w:t>
-      </w:r>
-    </w:p>
-    <w:p>
-      <w:pPr>
-        <w:spacing w:after="80" w:line="275" w:lineRule="auto"/>
-      </w:pPr>
-    </w:p>
-    <w:tbl>
-      <w:tblPr>
-        <w:tblW w:w="9200" w:type="dxa"/>
-        <w:tblBorders>
-          <w:top w:val="dashed" w:sz="6" w:space="0" w:color="B5522B"/>
-          <w:left w:val="dashed" w:sz="6" w:space="0" w:color="B5522B"/>
-          <w:bottom w:val="dashed" w:sz="6" w:space="0" w:color="B5522B"/>
-          <w:right w:val="dashed" w:sz="6" w:space="0" w:color="B5522B"/>
-          <w:insideH w:val="none" w:sz="0" w:space="0" w:color="FFFFFF"/>
-          <w:insideV w:val="none" w:sz="0" w:space="0" w:color="FFFFFF"/>
-        </w:tblBorders>
-        <w:tblCellMar>
-          <w:left w:w="10" w:type="dxa"/>
-          <w:right w:w="10" w:type="dxa"/>
-        </w:tblCellMar>
-        <w:tblLook w:val="0000" w:firstRow="0" w:lastRow="0" w:firstColumn="0" w:lastColumn="0" w:noHBand="0" w:noVBand="0"/>
-      </w:tblPr>
-      <w:tblGrid>
-        <w:gridCol w:w="9200"/>
-      </w:tblGrid>
-      <w:tr>
-        <w:tblPrEx>
-          <w:tblCellMar>
-            <w:top w:w="0" w:type="dxa"/>
-            <w:bottom w:w="0" w:type="dxa"/>
-          </w:tblCellMar>
-        </w:tblPrEx>
-        <w:tc>
-          <w:tcPr>
-            <w:tcW w:w="9200" w:type="dxa"/>
-            <w:shd w:val="clear" w:color="auto" w:fill="FBF3E4"/>
-            <w:tcMar>
-              <w:top w:w="200" w:type="dxa"/>
-              <w:left w:w="200" w:type="dxa"/>
-              <w:bottom w:w="200" w:type="dxa"/>
-              <w:right w:w="200" w:type="dxa"/>
-            </w:tcMar>
-          </w:tcPr>
-          <w:p>
-            <w:pPr>
-              <w:spacing w:after="60"/>
-              <w:jc w:val="center"/>
-            </w:pPr>
-            <w:r>
-              <w:rPr>
-                <w:b/>
-                <w:bCs/>
-                <w:caps/>
-                <w:color w:val="B5522B"/>
-                <w:spacing w:val="20"/>
-                <w:sz w:val="19"/>
-                <w:szCs w:val="19"/>
-              </w:rPr>
-              <w:t>PASTE SCREENSHOT HERE</w:t>
-            </w:r>
-          </w:p>
-          <w:p>
-            <w:pPr>
-              <w:jc w:val="center"/>
-            </w:pPr>
-            <w:r>
-              <w:rPr>
-                <w:i/>
-                <w:iCs/>
-                <w:color w:val="8A8073"/>
-                <w:sz w:val="19"/>
-                <w:szCs w:val="19"/>
-              </w:rPr>
-              <w:t>The client step showing the date of birth, and the review snapshot showing Calculated Age 47</w:t>
-            </w:r>
-          </w:p>
-        </w:tc>
-      </w:tr>
-    </w:tbl>
-    <w:p>
       <w:r>
         <w:br w:type="page"/>
       </w:r>
@@ -4624,7 +3741,15 @@
         <w:spacing w:after="130" w:line="275" w:lineRule="auto"/>
       </w:pPr>
       <w:r>
-        <w:t>Both of the following initially presented as application faults. They are recorded because distinguishing them from genuine defects took investigation, and because reporting either as an application defect would have undermined the rest of this log.</w:t>
+        <w:t xml:space="preserve">Both of the following initially presented as application faults. They are recorded because distinguishing them from genuine defects took investigation, and because reporting </w:t>
+      </w:r>
+      <w:proofErr w:type="gramStart"/>
+      <w:r>
+        <w:t>either as</w:t>
+      </w:r>
+      <w:proofErr w:type="gramEnd"/>
+      <w:r>
+        <w:t xml:space="preserve"> an application defect would have undermined the rest of this log.</w:t>
       </w:r>
     </w:p>
     <w:p>
@@ -4676,12 +3801,6 @@
         <w:gridCol w:w="7000"/>
       </w:tblGrid>
       <w:tr>
-        <w:tblPrEx>
-          <w:tblCellMar>
-            <w:top w:w="0" w:type="dxa"/>
-            <w:bottom w:w="0" w:type="dxa"/>
-          </w:tblCellMar>
-        </w:tblPrEx>
         <w:tc>
           <w:tcPr>
             <w:tcW w:w="2200" w:type="dxa"/>
@@ -4737,12 +3856,6 @@
         </w:tc>
       </w:tr>
       <w:tr>
-        <w:tblPrEx>
-          <w:tblCellMar>
-            <w:top w:w="0" w:type="dxa"/>
-            <w:bottom w:w="0" w:type="dxa"/>
-          </w:tblCellMar>
-        </w:tblPrEx>
         <w:tc>
           <w:tcPr>
             <w:tcW w:w="2200" w:type="dxa"/>
@@ -4801,12 +3914,6 @@
         </w:tc>
       </w:tr>
       <w:tr>
-        <w:tblPrEx>
-          <w:tblCellMar>
-            <w:top w:w="0" w:type="dxa"/>
-            <w:bottom w:w="0" w:type="dxa"/>
-          </w:tblCellMar>
-        </w:tblPrEx>
         <w:tc>
           <w:tcPr>
             <w:tcW w:w="2200" w:type="dxa"/>
@@ -4862,12 +3969,6 @@
         </w:tc>
       </w:tr>
       <w:tr>
-        <w:tblPrEx>
-          <w:tblCellMar>
-            <w:top w:w="0" w:type="dxa"/>
-            <w:bottom w:w="0" w:type="dxa"/>
-          </w:tblCellMar>
-        </w:tblPrEx>
         <w:tc>
           <w:tcPr>
             <w:tcW w:w="2200" w:type="dxa"/>
@@ -4923,12 +4024,6 @@
         </w:tc>
       </w:tr>
       <w:tr>
-        <w:tblPrEx>
-          <w:tblCellMar>
-            <w:top w:w="0" w:type="dxa"/>
-            <w:bottom w:w="0" w:type="dxa"/>
-          </w:tblCellMar>
-        </w:tblPrEx>
         <w:tc>
           <w:tcPr>
             <w:tcW w:w="2200" w:type="dxa"/>
@@ -5083,12 +4178,6 @@
         <w:gridCol w:w="7000"/>
       </w:tblGrid>
       <w:tr>
-        <w:tblPrEx>
-          <w:tblCellMar>
-            <w:top w:w="0" w:type="dxa"/>
-            <w:bottom w:w="0" w:type="dxa"/>
-          </w:tblCellMar>
-        </w:tblPrEx>
         <w:tc>
           <w:tcPr>
             <w:tcW w:w="2200" w:type="dxa"/>
@@ -5144,12 +4233,6 @@
         </w:tc>
       </w:tr>
       <w:tr>
-        <w:tblPrEx>
-          <w:tblCellMar>
-            <w:top w:w="0" w:type="dxa"/>
-            <w:bottom w:w="0" w:type="dxa"/>
-          </w:tblCellMar>
-        </w:tblPrEx>
         <w:tc>
           <w:tcPr>
             <w:tcW w:w="2200" w:type="dxa"/>
@@ -5208,12 +4291,6 @@
         </w:tc>
       </w:tr>
       <w:tr>
-        <w:tblPrEx>
-          <w:tblCellMar>
-            <w:top w:w="0" w:type="dxa"/>
-            <w:bottom w:w="0" w:type="dxa"/>
-          </w:tblCellMar>
-        </w:tblPrEx>
         <w:tc>
           <w:tcPr>
             <w:tcW w:w="2200" w:type="dxa"/>
@@ -5269,12 +4346,6 @@
         </w:tc>
       </w:tr>
       <w:tr>
-        <w:tblPrEx>
-          <w:tblCellMar>
-            <w:top w:w="0" w:type="dxa"/>
-            <w:bottom w:w="0" w:type="dxa"/>
-          </w:tblCellMar>
-        </w:tblPrEx>
         <w:tc>
           <w:tcPr>
             <w:tcW w:w="2200" w:type="dxa"/>
@@ -5330,12 +4401,6 @@
         </w:tc>
       </w:tr>
       <w:tr>
-        <w:tblPrEx>
-          <w:tblCellMar>
-            <w:top w:w="0" w:type="dxa"/>
-            <w:bottom w:w="0" w:type="dxa"/>
-          </w:tblCellMar>
-        </w:tblPrEx>
         <w:tc>
           <w:tcPr>
             <w:tcW w:w="2200" w:type="dxa"/>
@@ -5413,7 +4478,23 @@
         <w:spacing w:after="130" w:line="275" w:lineRule="auto"/>
       </w:pPr>
       <w:r>
-        <w:t>A check on trust beneficiary validation passed in some runs and failed in others. On investigation the application it targeted had been submitted and could no longer accept new beneficiaries, so the save was refused for an unrelated reason. Pointing the same check at a draft produced the expected validation errors. Trust field validation works correctly.</w:t>
+        <w:t xml:space="preserve">A check on trust beneficiary validation passed in some runs and failed in others. </w:t>
+      </w:r>
+      <w:proofErr w:type="gramStart"/>
+      <w:r>
+        <w:t>On investigation</w:t>
+      </w:r>
+      <w:proofErr w:type="gramEnd"/>
+      <w:r>
+        <w:t xml:space="preserve"> the application it targeted had been submitted and could no longer accept new beneficiaries, so the </w:t>
+      </w:r>
+      <w:proofErr w:type="gramStart"/>
+      <w:r>
+        <w:t>save</w:t>
+      </w:r>
+      <w:proofErr w:type="gramEnd"/>
+      <w:r>
+        <w:t xml:space="preserve"> was refused for an unrelated reason. Pointing the same check at a draft produced the expected validation errors. Trust field validation works correctly.</w:t>
       </w:r>
     </w:p>
     <w:p>
@@ -5468,7 +4549,15 @@
         <w:spacing w:after="130" w:line="275" w:lineRule="auto"/>
       </w:pPr>
       <w:r>
-        <w:t>Six confirmed defects: four high severity and two medium. Three on FinServe Retail and three on Insurance Order Entry. Five are open; one is marked for retest because it stopped reproducing before the final run.</w:t>
+        <w:t xml:space="preserve">Six confirmed defects: four high severity and two </w:t>
+      </w:r>
+      <w:proofErr w:type="gramStart"/>
+      <w:r>
+        <w:t>medium</w:t>
+      </w:r>
+      <w:proofErr w:type="gramEnd"/>
+      <w:r>
+        <w:t>. Three on FinServe Retail and three on Insurance Order Entry. Five are open; one is marked for retest because it stopped reproducing before the final run.</w:t>
       </w:r>
     </w:p>
     <w:p>
@@ -5484,23 +4573,7 @@
         <w:spacing w:after="130" w:line="275" w:lineRule="auto"/>
       </w:pPr>
       <w:r>
-        <w:t xml:space="preserve">Seeded </w:t>
-      </w:r>
-      <w:proofErr w:type="spellStart"/>
-      <w:r>
-        <w:t>behaviour</w:t>
-      </w:r>
-      <w:proofErr w:type="spellEnd"/>
-      <w:r>
-        <w:t xml:space="preserve"> appears to be toggled server-side during a session, so this log describes the environment at the time of testing rather than a fixed state. Any retest should begin by establishing which </w:t>
-      </w:r>
-      <w:proofErr w:type="spellStart"/>
-      <w:r>
-        <w:t>behaviours</w:t>
-      </w:r>
-      <w:proofErr w:type="spellEnd"/>
-      <w:r>
-        <w:t xml:space="preserve"> are currently active.</w:t>
+        <w:t>Seeded behaviour appears to be toggled server-side during a session, so this log describes the environment at the time of testing rather than a fixed state. Any retest should begin by establishing which behaviours are currently active.</w:t>
       </w:r>
     </w:p>
     <w:sectPr>
@@ -6240,6 +5313,7 @@
   <w:style w:type="character" w:default="1" w:styleId="DefaultParagraphFont">
     <w:name w:val="Default Paragraph Font"/>
     <w:uiPriority w:val="1"/>
+    <w:semiHidden/>
     <w:unhideWhenUsed/>
   </w:style>
   <w:style w:type="table" w:default="1" w:styleId="TableNormal">

</xml_diff>